<commit_message>
Homepage-Texte laut Textfreigabe des Kunden (15 Wohneinheiten, 9 Altbauwohnungen, neue Formulierungen)
Co-Authored-By: Claude Opus 5.5 <noreply@anthropic.com>
</commit_message>
<xml_diff>
--- a/docs/Zimmermannplatz-6_Website-Texte_2026-10-05.docx
+++ b/docs/Zimmermannplatz-6_Website-Texte_2026-10-05.docx
@@ -183,7 +183,7 @@
                 <w:color w:val="101010"/>
                 <w:sz w:val="19"/>
               </w:rPr>
-              <w:t>Zimmermannplatz 6, 1090 Wien. 21 Wohneinheiten am Alsergrund: 15 Altbauwohnungen im Bestand und 6 Neubauwohnungen im Dachgeschoss, davon 2 Penthäuser, zusätzlich 1 Geschäftslokal. Fertigstellung Q1 2028.</w:t>
+              <w:t>Zimmermannplatz 6, 1090 Wien. 15 Wohneinheiten am Alsergrund: 9 Altbauwohnungen im Bestand und 6 Neubauwohnungen im Dachgeschoss, davon 2 Penthäuser, zusätzlich 1 Geschäftslokal. Projekt-Fertigstellung Q1 2028.</w:t>
             </w:r>
           </w:p>
         </w:tc>
@@ -691,7 +691,7 @@
                 <w:color w:val="101010"/>
                 <w:sz w:val="19"/>
               </w:rPr>
-              <w:t>21 Wohneinheiten: 15 Altbauwohnungen im Bestand und 6 Neubauwohnungen unter einem neuen Dach, davon 2 Penthäuser. Viele mit Blick auf den Zimmermannplatz oder in den Garten im Hof.</w:t>
+              <w:t>15 Wohneinheiten: 9 Altbauwohnungen im Bestand und 6 Neubauwohnungen unter einem neuen Dach, davon 2 Penthäuser. Viele mit Blick auf den Zimmermannplatz oder in den hauseigenen Garten.</w:t>
             </w:r>
           </w:p>
         </w:tc>
@@ -996,7 +996,7 @@
                 <w:color w:val="101010"/>
                 <w:sz w:val="19"/>
               </w:rPr>
-              <w:t>Ein Ort mit Geschichte, neu gedacht für zeitgemäßes Wohnen.</w:t>
+              <w:t>Ein Ort mit Geschichte, neu gestaltet für höchste Ansprüche an zeitgemäßes Wohnen.</w:t>
             </w:r>
           </w:p>
         </w:tc>
@@ -1032,7 +1032,7 @@
                 <w:color w:val="101010"/>
                 <w:sz w:val="19"/>
               </w:rPr>
-              <w:t>Hochwertige Architektur, nachhaltige Bauweise und durchdachte Grundrisse schaffen Wohnraum mit Zukunft. Im gründerzeitlichen Bestand liegen 15 Altbauwohnungen, die sanierten mit Fischgrätparkett. Darüber entstehen im neuen Dachgeschoss 6 Neubauwohnungen mit Loggia, Balkon oder Terrasse, davon 2 Penthäuser mit Dachterrasse.</w:t>
+              <w:t>Hochwertige Architektur, nachhaltige Bauweise und durchdachte Grundrisse: Hier wird modernster Wohnraum geschaffen. Im gründerzeitlichen Bestand liegen 9 Altbauwohnungen, die generalsaniert werden. Darüber entstehen im 1. Dachgeschoss 4 eingeschossige Neubauwohnungen mit Loggia, Balkon oder Terrasse sowie 2 eingeschossige Penthäuser mit Dachterrasse im 2. Dachgeschoss.</w:t>
             </w:r>
           </w:p>
         </w:tc>
@@ -1068,7 +1068,7 @@
                 <w:color w:val="101010"/>
                 <w:sz w:val="19"/>
               </w:rPr>
-              <w:t>Das Eckhaus liegt am Zimmermannplatz im 9. Bezirk. Die Wohnungen im Bestand blicken auf den Platz, in den Hof oder als Durchstecker auf beides. Alle Einheiten werden über eine Wärmepumpe versorgt, das Haus verabschiedet sich vom Gas.</w:t>
+              <w:t>Die Eckliegenschaft befindet sich am Zimmermannplatz im 9. Bezirk. Die Wohnungen im Bestand bieten entweder einen Weitblick über den Platz oder blicken zum Garten, einige auch in beide Richtungen. Alle sanierten Einheiten werden über eine neu geschaffene Wärmepumpe versorgt.</w:t>
             </w:r>
           </w:p>
         </w:tc>
@@ -1104,7 +1104,7 @@
                 <w:color w:val="101010"/>
                 <w:sz w:val="19"/>
               </w:rPr>
-              <w:t>21</w:t>
+              <w:t>15</w:t>
             </w:r>
           </w:p>
         </w:tc>
@@ -1176,7 +1176,7 @@
                 <w:color w:val="101010"/>
                 <w:sz w:val="19"/>
               </w:rPr>
-              <w:t>15</w:t>
+              <w:t>9</w:t>
             </w:r>
           </w:p>
         </w:tc>
@@ -1752,7 +1752,7 @@
                 <w:color w:val="101010"/>
                 <w:sz w:val="19"/>
               </w:rPr>
-              <w:t>Das Bestehende bewahren. Das Neue darüber setzen.</w:t>
+              <w:t>Bestehendes bewahren. Neues aufbauen.</w:t>
             </w:r>
           </w:p>
         </w:tc>
@@ -2178,7 +2178,7 @@
                 <w:color w:val="101010"/>
                 <w:sz w:val="19"/>
               </w:rPr>
-              <w:t>Benannt ist der Platz nach Georg Ritter von Zimmermann, einem Wohltäter. Sein Wahlspruch Labore et Perseverantia, durch Arbeit und Ausdauer, passt zu einem Haus, das sorgfältig saniert und behutsam weitergebaut wird. Der Platz liegt nahe der Währinger Straße, umgeben von historischen Häusern.</w:t>
+              <w:t>Benannt ist der Platz nach Georg Ritter von Zimmermann, einem Wohltäter. Sein Wahlspruch „Labore et Perseverantia“, durch Arbeit und Ausdauer, passt zu einem Haus, das sorgfältig saniert und behutsam weitergebaut wird. Der Platz liegt nahe der Währinger Straße, umgeben von historischen Häusern.</w:t>
             </w:r>
           </w:p>
         </w:tc>
@@ -2250,7 +2250,7 @@
                 <w:color w:val="101010"/>
                 <w:sz w:val="19"/>
               </w:rPr>
-              <w:t>Das Palais Liechtenstein, das ehemalige Wohnhaus Sigmund Freuds und die Gassen des Servitenviertels prägen den Bezirk bis heute als Ort von Kultur und Wissenschaft.</w:t>
+              <w:t>Die Volksoper, das WUK und das etwas weiter entfernte Palais Liechtenstein, das ehemalige Wohnhaus Sigmund Freuds und die Gassen des Servitenviertels prägen den 9. Bezirk bis heute als Ort von Kultur und Wissenschaft.</w:t>
             </w:r>
           </w:p>
         </w:tc>
@@ -3723,7 +3723,7 @@
                 <w:color w:val="101010"/>
                 <w:sz w:val="19"/>
               </w:rPr>
-              <w:t>In unmittelbarer Nähe liegen die belebte Liechtensteinstraße und das charmante Servitenviertel mit Geschäften, Banken, Apotheken, Buchhandlungen und Cafés. Der Viktor-Frankl-Park, der Liechtensteinpark und das Alte AKH sind Rückzugsorte für Läufer und spielende Kinder. Zahlreiche Bildungseinrichtungen und Universitäten liegen in Gehweite oder wenige Stationen entfernt.</w:t>
+              <w:t>In unmittelbarer Nähe liegen die belebte Liechtensteinstraße und das charmante Servitenviertel mit Geschäften, Banken, Apotheken, Buchhandlungen und Cafés. Der Viktor-Frankl-Park, der Liechtensteinpark und das Alte AKH sind Rückzugsorte für Läufer und spielende Kinder. Zahlreiche Bildungseinrichtungen und Universitäten liegen in Gehweite oder wenige Bus- oder Straßenbahnstationen entfernt.</w:t>
             </w:r>
           </w:p>
         </w:tc>
@@ -3828,7 +3828,7 @@
                 <w:color w:val="101010"/>
                 <w:sz w:val="19"/>
               </w:rPr>
-              <w:t>Wohnen im neuen Dach</w:t>
+              <w:t>Wohnen im neuen Dachausbau</w:t>
             </w:r>
           </w:p>
         </w:tc>
@@ -4077,7 +4077,7 @@
                 <w:color w:val="101010"/>
                 <w:sz w:val="19"/>
               </w:rPr>
-              <w:t>15 Bestand</w:t>
+              <w:t>9 Bestand</w:t>
             </w:r>
           </w:p>
         </w:tc>
@@ -4149,7 +4149,7 @@
                 <w:color w:val="101010"/>
                 <w:sz w:val="19"/>
               </w:rPr>
-              <w:t>Altbauwohnungen mit 2 bis 4 Zimmern vom Erdgeschoss bis in den 3. Stock. Die sanierten erhalten Fischgrätparkett, die Räume bleiben hoch, der Blick geht auf den Platz oder in den Garten. Durchstecker verbinden beides.</w:t>
+              <w:t>Altbauwohnungen mit 2 bis 4 Zimmern vom Erdgeschoss bis in den 3. Stock. Alle Bestandswohnungen werden stilgemäß saniert, die Raumhöhe und die Altbauelemente werden erhalten. Der Blick reicht über den Platz oder in den Garten, viele Wohnungen bieten Räume in beide Richtungen.</w:t>
             </w:r>
           </w:p>
         </w:tc>
@@ -4401,7 +4401,7 @@
                 <w:color w:val="101010"/>
                 <w:sz w:val="19"/>
               </w:rPr>
-              <w:t>6 Neubauwohnungen mit Außenflächen: vier im 1. Dachgeschoss mit Loggia, Balkon oder Terrasse, darüber 2 Penthäuser mit Terrasse und Dachterrasse. Ein eigenes Geschoss über den Dächern des Alsergrunds.</w:t>
+              <w:t>6 Neubauwohnungen mit Außenflächen: vier im 1. Dachgeschoss mit Loggia, Balkon oder Terrasse, darüber 2 Penthäuser mit Terrasse und Dachterrasse. Ein Dachaufbau auf zwei Ebenen mit Blick über den Alsergrund.</w:t>
             </w:r>
           </w:p>
         </w:tc>
@@ -5697,7 +5697,7 @@
                 <w:color w:val="101010"/>
                 <w:sz w:val="19"/>
               </w:rPr>
-              <w:t>Neuer Aufzug vom Kellergeschoss bis ins Dachgeschoss, Penthouse-Steuerung für die Dachwohnungen. Einzelraumregelung im Bestand, KNX Gebäudeautomation im Dach. Stiegenhaus und Allgemeinbereiche mit hochwertigen Oberflächen.</w:t>
+              <w:t>Der neu geschaffene Aufzug, der alle Geschosse vom Keller bis ins Dachgeschoss erschließen wird, hat zusätzlich eine eigene Steuerung für die beiden Penthäuser. Die Beheizung im Bestand erfolgt über eine Einzelraumregelung, im Dach über KNX-Gebäudeautomation. Stiegenhaus und Allgemeinbereiche mit hochwertigen Oberflächen.</w:t>
             </w:r>
           </w:p>
         </w:tc>
@@ -5805,7 +5805,7 @@
                 <w:color w:val="101010"/>
                 <w:sz w:val="19"/>
               </w:rPr>
-              <w:t>Garten im Hof</w:t>
+              <w:t>Garten derLiegenschaft</w:t>
             </w:r>
           </w:p>
         </w:tc>
@@ -6021,7 +6021,7 @@
                 <w:color w:val="101010"/>
                 <w:sz w:val="19"/>
               </w:rPr>
-              <w:t>Wohnungen, die den Block durchqueren: vorne der Zimmermannplatz mit seinen Bäumen, hinten der Garten im Innenhof. Licht von zwei Seiten, Ruhe auf der einen, Stadt auf der anderen.</w:t>
+              <w:t>Wohnungen, die in Richtung Straße und Garten ausgerichtet sind: vorne der Zimmermannplatz mit seinen Bäumen, hofseitig der Garten. Belichtung von zwei Seiten.</w:t>
             </w:r>
           </w:p>
         </w:tc>

</xml_diff>